<commit_message>
chore: adiciona fontes Poppins, .eleventyignore e template atualizado
- assets/fonts/Poppins/: família completa TTF + licença OFL (base para
  auto-hospedagem futura — ver pendências do README)
- .eleventyignore: exclui artefatos internos do build
- .gitignore: ignora .claude/ (artefatos locais do Claude Code)
- atualiza Caminhos-template-completo.docx

Co-Authored-By: Claude Fable 5 <noreply@anthropic.com>
</commit_message>
<xml_diff>
--- a/assets/editais/Caminhos-template-completo.docx
+++ b/assets/editais/Caminhos-template-completo.docx
@@ -34,95 +34,20 @@
           <w:sz w:val="18"/>
           <w:szCs w:val="18"/>
         </w:rPr>
-        <w:t xml:space="preserve">(título </w:t>
-      </w:r>
+        <w:t>(título e subtítulo com até 100 caracteres com espaços, ao todo)</w:t>
+      </w:r>
+    </w:p>
+    <w:p>
+      <w:pPr>
+        <w:jc w:val="center"/>
+      </w:pPr>
       <w:r>
         <w:rPr>
           <w:color w:val="0070C0"/>
           <w:sz w:val="18"/>
           <w:szCs w:val="18"/>
         </w:rPr>
-        <w:t xml:space="preserve">e subtítulo </w:t>
-      </w:r>
-      <w:r>
-        <w:rPr>
-          <w:color w:val="0070C0"/>
-          <w:sz w:val="18"/>
-          <w:szCs w:val="18"/>
-        </w:rPr>
-        <w:t xml:space="preserve">com até </w:t>
-      </w:r>
-      <w:r>
-        <w:rPr>
-          <w:color w:val="0070C0"/>
-          <w:sz w:val="18"/>
-          <w:szCs w:val="18"/>
-        </w:rPr>
-        <w:t>100</w:t>
-      </w:r>
-      <w:r>
-        <w:rPr>
-          <w:color w:val="0070C0"/>
-          <w:sz w:val="18"/>
-          <w:szCs w:val="18"/>
-        </w:rPr>
-        <w:t xml:space="preserve"> caracteres com espaços,</w:t>
-      </w:r>
-      <w:r>
-        <w:rPr>
-          <w:color w:val="0070C0"/>
-          <w:sz w:val="18"/>
-          <w:szCs w:val="18"/>
-        </w:rPr>
-        <w:t xml:space="preserve"> ao todo)</w:t>
-      </w:r>
-    </w:p>
-    <w:p>
-      <w:pPr>
-        <w:jc w:val="center"/>
-      </w:pPr>
-      <w:r>
-        <w:rPr>
-          <w:color w:val="0070C0"/>
-          <w:sz w:val="18"/>
-          <w:szCs w:val="18"/>
-        </w:rPr>
         <w:t>(a submissão pode ser feita em português ou em espanhol; em submissões em espanhol, mantenha a mesma estrutura e formatação, adaptando os rótulos e o texto para o idioma escolhido)</w:t>
-      </w:r>
-      <w:r>
-        <w:rPr>
-          <w:color w:val="0070C0"/>
-          <w:sz w:val="18"/>
-          <w:szCs w:val="18"/>
-        </w:rPr>
-      </w:r>
-      <w:r>
-        <w:rPr>
-          <w:color w:val="0070C0"/>
-          <w:sz w:val="18"/>
-          <w:szCs w:val="18"/>
-        </w:rPr>
-      </w:r>
-      <w:r>
-        <w:rPr>
-          <w:color w:val="0070C0"/>
-          <w:sz w:val="18"/>
-          <w:szCs w:val="18"/>
-        </w:rPr>
-      </w:r>
-      <w:r>
-        <w:rPr>
-          <w:color w:val="0070C0"/>
-          <w:sz w:val="18"/>
-          <w:szCs w:val="18"/>
-        </w:rPr>
-      </w:r>
-      <w:r>
-        <w:rPr>
-          <w:color w:val="0070C0"/>
-          <w:sz w:val="18"/>
-          <w:szCs w:val="18"/>
-        </w:rPr>
       </w:r>
     </w:p>
     <w:p>
@@ -182,35 +107,7 @@
           <w:sz w:val="22"/>
           <w:szCs w:val="22"/>
         </w:rPr>
-        <w:t xml:space="preserve">deve apresentar, de forma sucinta, a abordagem principal (o </w:t>
-      </w:r>
-      <w:r>
-        <w:rPr>
-          <w:sz w:val="22"/>
-          <w:szCs w:val="22"/>
-        </w:rPr>
-        <w:t xml:space="preserve">ponto </w:t>
-      </w:r>
-      <w:r>
-        <w:rPr>
-          <w:sz w:val="22"/>
-          <w:szCs w:val="22"/>
-        </w:rPr>
-        <w:t>central) de sua pesquisa de modo a permitir ao leitor identificar rapidamente o assunto tratado.</w:t>
-      </w:r>
-      <w:r>
-        <w:rPr>
-          <w:sz w:val="22"/>
-          <w:szCs w:val="22"/>
-        </w:rPr>
-        <w:t xml:space="preserve"> </w:t>
-      </w:r>
-      <w:r>
-        <w:rPr>
-          <w:sz w:val="22"/>
-          <w:szCs w:val="22"/>
-        </w:rPr>
-        <w:t xml:space="preserve">Resumo de um só parágrafo em português, máximo 5 linhas. </w:t>
+        <w:t xml:space="preserve">deve apresentar, de forma sucinta, a abordagem principal (o ponto central) de sua pesquisa de modo a permitir ao leitor identificar rapidamente o assunto tratado. Resumo de um só parágrafo em português, máximo 5 linhas. </w:t>
       </w:r>
       <w:r>
         <w:rPr>
@@ -218,55 +115,7 @@
           <w:sz w:val="18"/>
           <w:szCs w:val="18"/>
         </w:rPr>
-        <w:t>(</w:t>
-      </w:r>
-      <w:r>
-        <w:rPr>
-          <w:color w:val="0070C0"/>
-          <w:sz w:val="18"/>
-          <w:szCs w:val="18"/>
-        </w:rPr>
-        <w:t>Georgia</w:t>
-      </w:r>
-      <w:r>
-        <w:rPr>
-          <w:color w:val="0070C0"/>
-          <w:sz w:val="18"/>
-          <w:szCs w:val="18"/>
-        </w:rPr>
-        <w:t>, 1</w:t>
-      </w:r>
-      <w:r>
-        <w:rPr>
-          <w:color w:val="0070C0"/>
-          <w:sz w:val="18"/>
-          <w:szCs w:val="18"/>
-        </w:rPr>
-        <w:t>1</w:t>
-      </w:r>
-      <w:r>
-        <w:rPr>
-          <w:color w:val="0070C0"/>
-          <w:sz w:val="18"/>
-          <w:szCs w:val="18"/>
-        </w:rPr>
-        <w:t>, justificado</w:t>
-      </w:r>
-      <w:r>
-        <w:rPr>
-          <w:color w:val="0070C0"/>
-          <w:sz w:val="18"/>
-          <w:szCs w:val="18"/>
-        </w:rPr>
-        <w:t>, espaçamento simples</w:t>
-      </w:r>
-      <w:r>
-        <w:rPr>
-          <w:color w:val="0070C0"/>
-          <w:sz w:val="18"/>
-          <w:szCs w:val="18"/>
-        </w:rPr>
-        <w:t>)</w:t>
+        <w:t>(Georgia, 11, justificado, espaçamento simples)</w:t>
       </w:r>
     </w:p>
     <w:p>
@@ -337,14 +186,7 @@
           <w:sz w:val="22"/>
           <w:szCs w:val="22"/>
         </w:rPr>
-        <w:t>esumo de um só parágrafo em inglês, máximo 5 linhas.</w:t>
-      </w:r>
-      <w:r>
-        <w:rPr>
-          <w:sz w:val="22"/>
-          <w:szCs w:val="22"/>
-        </w:rPr>
-        <w:t xml:space="preserve"> </w:t>
+        <w:t xml:space="preserve">esumo de um só parágrafo em inglês, máximo 5 linhas. </w:t>
       </w:r>
       <w:r>
         <w:rPr>
@@ -352,39 +194,7 @@
           <w:sz w:val="18"/>
           <w:szCs w:val="18"/>
         </w:rPr>
-        <w:t>(Georgia, 1</w:t>
-      </w:r>
-      <w:r>
-        <w:rPr>
-          <w:color w:val="0070C0"/>
-          <w:sz w:val="18"/>
-          <w:szCs w:val="18"/>
-        </w:rPr>
-        <w:t>1</w:t>
-      </w:r>
-      <w:r>
-        <w:rPr>
-          <w:color w:val="0070C0"/>
-          <w:sz w:val="18"/>
-          <w:szCs w:val="18"/>
-        </w:rPr>
-        <w:t>, justificado</w:t>
-      </w:r>
-      <w:r>
-        <w:rPr>
-          <w:color w:val="0070C0"/>
-          <w:sz w:val="18"/>
-          <w:szCs w:val="18"/>
-        </w:rPr>
-        <w:t>, espaçamento simples</w:t>
-      </w:r>
-      <w:r>
-        <w:rPr>
-          <w:color w:val="0070C0"/>
-          <w:sz w:val="18"/>
-          <w:szCs w:val="18"/>
-        </w:rPr>
-        <w:t>)</w:t>
+        <w:t>(Georgia, 11, justificado, espaçamento simples)</w:t>
       </w:r>
     </w:p>
     <w:p>
@@ -467,96 +277,21 @@
           <w:sz w:val="18"/>
           <w:szCs w:val="18"/>
         </w:rPr>
-        <w:t>(</w:t>
-      </w:r>
-      <w:r>
-        <w:rPr>
-          <w:b w:val="0"/>
-          <w:bCs w:val="0"/>
-          <w:color w:val="0070C0"/>
-          <w:sz w:val="18"/>
-          <w:szCs w:val="18"/>
-        </w:rPr>
-        <w:t xml:space="preserve">Estilo Título 2: fonte </w:t>
-      </w:r>
-      <w:r>
-        <w:rPr>
-          <w:b w:val="0"/>
-          <w:bCs w:val="0"/>
-          <w:color w:val="0070C0"/>
-          <w:sz w:val="18"/>
-          <w:szCs w:val="18"/>
-        </w:rPr>
-        <w:t>Georgia, 1</w:t>
-      </w:r>
-      <w:r>
-        <w:rPr>
-          <w:b w:val="0"/>
-          <w:bCs w:val="0"/>
-          <w:color w:val="0070C0"/>
-          <w:sz w:val="18"/>
-          <w:szCs w:val="18"/>
-        </w:rPr>
-        <w:t>2</w:t>
-      </w:r>
-      <w:r>
-        <w:rPr>
-          <w:b w:val="0"/>
-          <w:bCs w:val="0"/>
-          <w:color w:val="0070C0"/>
-          <w:sz w:val="18"/>
-          <w:szCs w:val="18"/>
-        </w:rPr>
-        <w:t xml:space="preserve">, </w:t>
-      </w:r>
-      <w:r>
-        <w:rPr>
-          <w:b w:val="0"/>
-          <w:bCs w:val="0"/>
-          <w:color w:val="0070C0"/>
-          <w:sz w:val="18"/>
-          <w:szCs w:val="18"/>
-        </w:rPr>
-        <w:t>negrito</w:t>
-      </w:r>
-      <w:r>
-        <w:rPr>
-          <w:b w:val="0"/>
-          <w:bCs w:val="0"/>
-          <w:color w:val="0070C0"/>
-          <w:sz w:val="18"/>
-          <w:szCs w:val="18"/>
-        </w:rPr>
-        <w:t>)</w:t>
-      </w:r>
-    </w:p>
-    <w:p>
-      <w:r>
-        <w:t xml:space="preserve">O corpo do texto deverá estar formatado em no mínimo 8 e no máximo 12 páginas, em fonte </w:t>
-      </w:r>
-      <w:r>
-        <w:t>Georgia</w:t>
-      </w:r>
-      <w:r>
-        <w:t xml:space="preserve"> tamanho 12, espaço 1,5, e alinhamento justificado, incluindo notas de rodapé e referências bibliográficas, se for o caso, já incluídas as imagens (no máximo 3, enviadas em arquivo jpeg</w:t>
-      </w:r>
-      <w:r>
-        <w:t xml:space="preserve"> ou png</w:t>
-      </w:r>
-      <w:r>
-        <w:t xml:space="preserve"> de 600 dpi, a parte).</w:t>
-      </w:r>
-    </w:p>
-    <w:p>
+        <w:t>(Estilo Título 2: fonte Georgia, 12, negrito)</w:t>
+      </w:r>
+    </w:p>
+    <w:p>
+      <w:r>
+        <w:t xml:space="preserve">O corpo do texto deverá estar formatado em no mínimo 8 e no máximo 12 páginas, em fonte Georgia tamanho 12, espaço 1,5, e alinhamento justificado, </w:t>
+      </w:r>
       <w:r>
         <w:lastRenderedPageBreak/>
-        <w:t xml:space="preserve">O texto deve apresentar o desenvolvimento da pesquisa e as reflexões </w:t>
-      </w:r>
-      <w:r>
-        <w:t>acerca dela</w:t>
-      </w:r>
-      <w:r>
-        <w:t>. Pode conter subtítulos, visando melhor fluxo de leitura.</w:t>
+        <w:t>incluindo notas de rodapé e referências bibliográficas, se for o caso, já incluídas as imagens (no máximo 3, enviadas em arquivo jpeg ou png de 600 dpi, a parte).</w:t>
+      </w:r>
+    </w:p>
+    <w:p>
+      <w:r>
+        <w:t>O texto deve apresentar o desenvolvimento da pesquisa e as reflexões acerca dela. Pode conter subtítulos, visando melhor fluxo de leitura.</w:t>
       </w:r>
     </w:p>
     <w:p>
@@ -595,19 +330,7 @@
       </w:r>
       <w:r>
         <w:tab/>
-        <w:t>Nas citações de síntese ou indiretas usar a seguinte referenciação: (</w:t>
-      </w:r>
-      <w:r>
-        <w:t>Sobrenome do autor</w:t>
-      </w:r>
-      <w:r>
-        <w:t>, ano) exemplo: (</w:t>
-      </w:r>
-      <w:r>
-        <w:t>Barthes</w:t>
-      </w:r>
-      <w:r>
-        <w:t>, 1962)</w:t>
+        <w:t>Nas citações de síntese ou indiretas usar a seguinte referenciação: (Sobrenome do autor, ano) exemplo: (Barthes, 1962)</w:t>
       </w:r>
     </w:p>
     <w:p>
@@ -616,13 +339,7 @@
       </w:r>
       <w:r>
         <w:tab/>
-        <w:t>nas citações literais presentes no corpo do texto use ‘aspas duplas’, seguida da referenciação, como no exemplo acima, acrescida a página exata de onde são retiradas as frases. Exemplo (</w:t>
-      </w:r>
-      <w:r>
-        <w:t>Pereira</w:t>
-      </w:r>
-      <w:r>
-        <w:t xml:space="preserve">, 2020, p. 56) </w:t>
+        <w:t xml:space="preserve">nas citações literais presentes no corpo do texto use ‘aspas duplas’, seguida da referenciação, como no exemplo acima, acrescida a página exata de onde são retiradas as frases. Exemplo (Pereira, 2020, p. 56) </w:t>
       </w:r>
     </w:p>
     <w:p>
@@ -631,13 +348,7 @@
       </w:r>
       <w:r>
         <w:tab/>
-        <w:t xml:space="preserve">As citações com mais de três linhas devem estar em parágrafo separado, com recuo de 4cm da margem esquerda, fonte </w:t>
-      </w:r>
-      <w:r>
-        <w:t>Georgia</w:t>
-      </w:r>
-      <w:r>
-        <w:t>, corpo 10, espaçamento simples, sem aspas. (NBR10520)</w:t>
+        <w:t>As citações com mais de três linhas devem estar em parágrafo separado, com recuo de 4cm da margem esquerda, fonte Georgia, corpo 10, espaçamento simples, sem aspas. (NBR10520)</w:t>
       </w:r>
     </w:p>
     <w:p>
@@ -667,12 +378,22 @@
     </w:p>
     <w:p>
       <w:r>
-        <w:t>Utilizar no máximo 3 tabelas ou Figuras com título e fonte ou autoria. Caso haja direitos sobre as imagens usadas tenham direitos autorais em vigor, caberá enviar a permissão de uso das mesmas.</w:t>
-      </w:r>
-    </w:p>
-    <w:p>
-      <w:r>
-        <w:t xml:space="preserve">Devem ser inseridas no corpo do texto, próximo ao parágrafo a que se referem, centralizadas, espaço de uma linha para separar texto e figuras ou tabelas; títulos das figuras acima das mesmas (ver exemplo), </w:t>
+        <w:t xml:space="preserve">Utilizar no máximo 3 tabelas ou Figuras com título e fonte ou autoria. Caso haja direitos sobre as imagens usadas tenham direitos autorais em vigor, caberá enviar a permissão de uso </w:t>
+      </w:r>
+      <w:r>
+        <w:t>delas</w:t>
+      </w:r>
+      <w:r>
+        <w:t>.</w:t>
+      </w:r>
+    </w:p>
+    <w:p>
+      <w:r>
+        <w:t xml:space="preserve">Devem ser inseridas no corpo do texto, próximo ao parágrafo a que se referem, centralizadas, espaço de uma linha para separar texto e figuras ou tabelas; títulos </w:t>
+      </w:r>
+      <w:r>
+        <w:lastRenderedPageBreak/>
+        <w:t xml:space="preserve">das figuras acima das mesmas (ver exemplo), </w:t>
       </w:r>
       <w:r>
         <w:t xml:space="preserve">no estilo “título de figuras e tabelas”: </w:t>
@@ -684,29 +405,13 @@
         <w:t>Courier New</w:t>
       </w:r>
       <w:r>
-        <w:t xml:space="preserve">, corpo 10, centralizado. Abaixo, indicar a fonte com </w:t>
-      </w:r>
-      <w:r>
-        <w:lastRenderedPageBreak/>
-        <w:t>a mesma formatação do título. As figuras e tabelas devem ser numeradas sequencialmente (ex.: Figura1, figura2, Tabela 1, Tabela 2...)</w:t>
+        <w:t>, corpo 10, centralizado. Abaixo, indicar a fonte com a mesma formatação do título. As figuras e tabelas devem ser numeradas sequencialmente (ex.: Figura1, figura2, Tabela 1, Tabela 2...)</w:t>
       </w:r>
       <w:r>
         <w:t>.</w:t>
       </w:r>
       <w:r>
-        <w:t xml:space="preserve"> Figuras em formato JPEG</w:t>
-      </w:r>
-      <w:r>
-        <w:t xml:space="preserve"> ou PNG</w:t>
-      </w:r>
-      <w:r>
-        <w:t>, com 600 dpi, devem ser enviadas em arquivo próprio</w:t>
-      </w:r>
-      <w:r>
-        <w:t>,</w:t>
-      </w:r>
-      <w:r>
-        <w:t xml:space="preserve"> a parte.</w:t>
+        <w:t xml:space="preserve"> Figuras em formato JPEG ou PNG, com 600 dpi, devem ser enviadas em arquivo próprio, a parte.</w:t>
       </w:r>
     </w:p>
     <w:p>
@@ -720,7 +425,7 @@
           <w:noProof/>
         </w:rPr>
         <w:drawing>
-          <wp:anchor distT="0" distB="0" distL="114300" distR="114300" simplePos="0" relativeHeight="251659264" behindDoc="0" locked="0" layoutInCell="1" allowOverlap="1" wp14:anchorId="39275998" wp14:editId="47CD3F7C">
+          <wp:anchor distT="0" distB="0" distL="114300" distR="114300" simplePos="0" relativeHeight="251659264" behindDoc="0" locked="0" layoutInCell="1" allowOverlap="1" wp14:anchorId="39275998" wp14:editId="15E9BFFE">
             <wp:simplePos x="0" y="0"/>
             <wp:positionH relativeFrom="margin">
               <wp:posOffset>716280</wp:posOffset>
@@ -824,13 +529,7 @@
     </w:p>
     <w:p>
       <w:r>
-        <w:t xml:space="preserve">Texto com a apresentação dos </w:t>
-      </w:r>
-      <w:r>
-        <w:t>resultados</w:t>
-      </w:r>
-      <w:r>
-        <w:t>, a síntese das reflexões e análises obtidas. Recomenda-se não utilizar citações diretas ou indiretas</w:t>
+        <w:t>Texto com a apresentação dos resultados, a síntese das reflexões e análises obtidas. Recomenda-se não utilizar citações diretas ou indiretas</w:t>
       </w:r>
       <w:r>
         <w:t>.</w:t>

</xml_diff>